<commit_message>
Agent Host changes for agents/mcp-setup-review-and-plan
</commit_message>
<xml_diff>
--- a/geo-agent-mcp-next-gates-plan.docx
+++ b/geo-agent-mcp-next-gates-plan.docx
@@ -36,7 +36,7 @@
           <w:sz w:val="20"/>
           <w:szCs w:val="20"/>
         </w:rPr>
-        <w:t xml:space="preserve">18 September 2026 | Gates D and E handoff</w:t>
+        <w:t xml:space="preserve">30 September 2026 | Gate C.5, D and E handoff</w:t>
       </w:r>
     </w:p>
     <w:p>
@@ -50,7 +50,7 @@
           <w:sz w:val="20"/>
           <w:szCs w:val="20"/>
         </w:rPr>
-        <w:t xml:space="preserve">Gates A-C are complete. The next developer should productionise the existing server for shared remote use, prove the real hosted topology, then run separately authorised live canaries. Do not redesign the workflow or weaken its human controls.</w:t>
+        <w:t xml:space="preserve">The automated VS Code path completes the 23-operation synthetic journey, reconnects after restart and sits on a 612-test green baseline. Close the interactive Copilot trust check before Gate D. Do not redesign the workflow or weaken its human controls.</w:t>
       </w:r>
     </w:p>
     <w:p>
@@ -246,7 +246,7 @@
                 <w:sz w:val="18"/>
                 <w:szCs w:val="18"/>
               </w:rPr>
-              <w:t xml:space="preserve">The local HTTP p95 is 82 ms, but that does not prove remote identity, storage or live completion performance.</w:t>
+              <w:t xml:space="preserve">The automated Copilot-equivalent flow passes on a 612-test green baseline; only the interactive VS Code trust and Copilot check remains in Gate C.5.</w:t>
             </w:r>
           </w:p>
         </w:tc>
@@ -584,7 +584,7 @@
                 <w:sz w:val="18"/>
                 <w:szCs w:val="18"/>
               </w:rPr>
-              <w:t xml:space="preserve">Gate D proves remote readiness. Gate E proves live acceptance.</w:t>
+              <w:t xml:space="preserve">Gate C.5 closes local usability. Gate D proves remote readiness. Gate E proves live acceptance.</w:t>
             </w:r>
           </w:p>
         </w:tc>
@@ -654,7 +654,7 @@
                 <w:sz w:val="18"/>
                 <w:szCs w:val="18"/>
               </w:rPr>
-              <w:t xml:space="preserve">Productionise the existing bounded asynchronous workflow instead of creating long-running MCP calls or a second orchestration engine.</w:t>
+              <w:t xml:space="preserve">Finish and stabilise the existing bounded asynchronous workflow before productionising it.</w:t>
             </w:r>
           </w:p>
         </w:tc>
@@ -890,7 +890,7 @@
                 <w:sz w:val="18"/>
                 <w:szCs w:val="18"/>
               </w:rPr>
-              <w:t xml:space="preserve">The final local suite passed 526 tests.</w:t>
+              <w:t xml:space="preserve">All 58 MCP and human-handoff tests pass; the complete repository suite passes 612 tests with 18 existing serialization warnings.</w:t>
             </w:r>
           </w:p>
         </w:tc>
@@ -992,7 +992,7 @@
                 <w:sz w:val="18"/>
                 <w:szCs w:val="18"/>
               </w:rPr>
-              <w:t xml:space="preserve">Catalogue 17,970 bytes; maximum response 4,982 bytes.</w:t>
+              <w:t xml:space="preserve">Stdio p95 19 ms; HTTP p95 117 ms; catalogue 17,970 bytes; maximum response 4,982 bytes.</w:t>
             </w:r>
           </w:p>
         </w:tc>
@@ -1062,7 +1062,7 @@
                 <w:sz w:val="18"/>
                 <w:szCs w:val="18"/>
               </w:rPr>
-              <w:t xml:space="preserve">The remaining route is operational hardening and measured acceptance.</w:t>
+              <w:t xml:space="preserve">Close the interactive local check, then harden the same workflow for shared use.</w:t>
             </w:r>
           </w:p>
         </w:tc>
@@ -1164,7 +1164,7 @@
                 <w:sz w:val="18"/>
                 <w:szCs w:val="18"/>
               </w:rPr>
-              <w:t xml:space="preserve">Complete an approved non-production Gate D deployment, then request separate authority for Gate E.</w:t>
+              <w:t xml:space="preserve">Complete the interactive Gate C.5 check before an approved Gate D deployment.</w:t>
             </w:r>
           </w:p>
         </w:tc>
@@ -1586,7 +1586,7 @@
                 <w:sz w:val="18"/>
                 <w:szCs w:val="18"/>
               </w:rPr>
-              <w:t xml:space="preserve">C. Local performance</w:t>
+              <w:t xml:space="preserve">C/C.5 Local performance and VS Code</w:t>
             </w:r>
           </w:p>
         </w:tc>
@@ -1618,7 +1618,7 @@
                 <w:sz w:val="18"/>
                 <w:szCs w:val="18"/>
               </w:rPr>
-              <w:t xml:space="preserve">Complete</w:t>
+              <w:t xml:space="preserve">Automated proof complete; interactive pending</w:t>
             </w:r>
           </w:p>
         </w:tc>
@@ -1650,7 +1650,7 @@
                 <w:sz w:val="18"/>
                 <w:szCs w:val="18"/>
               </w:rPr>
-              <w:t xml:space="preserve">Five clients per transport, 1,000 saved runs, one active job and 200 calls per transport.</w:t>
+              <w:t xml:space="preserve">20-tool workspace discovery, full synthetic handoff, restart proof, five clients, 1,000 runs and 200 calls per transport.</w:t>
             </w:r>
           </w:p>
         </w:tc>
@@ -2091,7 +2091,7 @@
                 <w:sz w:val="18"/>
                 <w:szCs w:val="18"/>
               </w:rPr>
-              <w:t xml:space="preserve">15 ms</w:t>
+              <w:t xml:space="preserve">19 ms</w:t>
             </w:r>
           </w:p>
         </w:tc>
@@ -2123,7 +2123,7 @@
                 <w:sz w:val="18"/>
                 <w:szCs w:val="18"/>
               </w:rPr>
-              <w:t xml:space="preserve">82 ms</w:t>
+              <w:t xml:space="preserve">117 ms</w:t>
             </w:r>
           </w:p>
         </w:tc>
@@ -2225,7 +2225,7 @@
                 <w:sz w:val="18"/>
                 <w:szCs w:val="18"/>
               </w:rPr>
-              <w:t xml:space="preserve">126 ms</w:t>
+              <w:t xml:space="preserve">136 ms</w:t>
             </w:r>
           </w:p>
         </w:tc>
@@ -2257,7 +2257,7 @@
                 <w:sz w:val="18"/>
                 <w:szCs w:val="18"/>
               </w:rPr>
-              <w:t xml:space="preserve">100 ms</w:t>
+              <w:t xml:space="preserve">169 ms</w:t>
             </w:r>
           </w:p>
         </w:tc>
@@ -5262,7 +5262,7 @@
                 <w:sz w:val="18"/>
                 <w:szCs w:val="18"/>
               </w:rPr>
-              <w:t xml:space="preserve">Current Gates A-C</w:t>
+              <w:t xml:space="preserve">Interactive Gate C.5</w:t>
             </w:r>
           </w:p>
         </w:tc>
@@ -6505,7 +6505,7 @@
                 <w:sz w:val="18"/>
                 <w:szCs w:val="18"/>
               </w:rPr>
-              <w:t xml:space="preserve">Install the pinned project in geo-agent/.venv and run all 526 tests.</w:t>
+              <w:t xml:space="preserve">Run the workspace and end-to-end verifiers, then confirm the 612-test baseline before Gate D.</w:t>
             </w:r>
           </w:p>
         </w:tc>
@@ -6715,7 +6715,7 @@
                 <w:sz w:val="18"/>
                 <w:szCs w:val="18"/>
               </w:rPr>
-              <w:t xml:space="preserve">Obtain the Gate D decisions before provisioning any Azure resource.</w:t>
+              <w:t xml:space="preserve">Close the interactive Gate C.5 check before provisioning any Azure resource.</w:t>
             </w:r>
           </w:p>
         </w:tc>
@@ -6929,7 +6929,7 @@
           <w:sz w:val="20"/>
           <w:szCs w:val="20"/>
         </w:rPr>
-        <w:t xml:space="preserve">Recommendation: proceed with Gate D only after the platform owner approves the target environment and identity model. Do not provision live provider capacity or enable live MCP until Gate D has passed and Gate E has separate written authorisation.</w:t>
+        <w:t xml:space="preserve">Recommendation: proceed with Gate D only after the interactive Gate C.5 check passes and the platform owner approves the environment and identity model. Do not provision live capacity or enable live MCP until Gate D passes and Gate E has written authorisation.</w:t>
       </w:r>
     </w:p>
     <w:sectPr>
@@ -6997,7 +6997,7 @@
         <w:sz w:val="17"/>
         <w:szCs w:val="17"/>
       </w:rPr>
-      <w:t xml:space="preserve">Gates D-E | Page </w:t>
+      <w:t xml:space="preserve">Gates C.5-E | Page </w:t>
     </w:r>
     <w:r>
       <w:rPr>

</xml_diff>

<commit_message>
Refresh MCP baseline after upstream rebase
Record the latest 615-test result and upstream base in the README, evidence JSON, and reviewer handoff documents.

Co-authored-by: Copilot <223556219+Copilot@users.noreply.github.com>
</commit_message>
<xml_diff>
--- a/geo-agent-mcp-next-gates-plan.docx
+++ b/geo-agent-mcp-next-gates-plan.docx
@@ -50,7 +50,7 @@
           <w:sz w:val="20"/>
           <w:szCs w:val="20"/>
         </w:rPr>
-        <w:t xml:space="preserve">The automated VS Code path completes the 23-operation synthetic journey, reconnects after restart and sits on a 612-test green baseline. Close the interactive Copilot trust check before Gate D. Do not redesign the workflow or weaken its human controls.</w:t>
+        <w:t xml:space="preserve">The automated VS Code path completes the 23-operation synthetic journey, reconnects after restart and sits on a 615-test green baseline. Close the interactive Copilot trust check before Gate D. Do not redesign the workflow or weaken its human controls.</w:t>
       </w:r>
     </w:p>
     <w:p>
@@ -246,7 +246,7 @@
                 <w:sz w:val="18"/>
                 <w:szCs w:val="18"/>
               </w:rPr>
-              <w:t xml:space="preserve">The automated Copilot-equivalent flow passes on a 612-test green baseline; only the interactive VS Code trust and Copilot check remains in Gate C.5.</w:t>
+              <w:t xml:space="preserve">The automated Copilot-equivalent flow passes on a 615-test green baseline; only the interactive VS Code trust and Copilot check remains in Gate C.5.</w:t>
             </w:r>
           </w:p>
         </w:tc>
@@ -890,7 +890,7 @@
                 <w:sz w:val="18"/>
                 <w:szCs w:val="18"/>
               </w:rPr>
-              <w:t xml:space="preserve">All 58 MCP and human-handoff tests pass; the complete repository suite passes 612 tests with 18 existing serialization warnings.</w:t>
+              <w:t xml:space="preserve">All 58 MCP and human-handoff tests pass; the complete repository suite passes 615 tests with 19 existing serialization warnings.</w:t>
             </w:r>
           </w:p>
         </w:tc>
@@ -6505,7 +6505,7 @@
                 <w:sz w:val="18"/>
                 <w:szCs w:val="18"/>
               </w:rPr>
-              <w:t xml:space="preserve">Run the workspace and end-to-end verifiers, then confirm the 612-test baseline before Gate D.</w:t>
+              <w:t xml:space="preserve">Run the workspace and end-to-end verifiers, then confirm the 615-test baseline before Gate D.</w:t>
             </w:r>
           </w:p>
         </w:tc>

</xml_diff>